<commit_message>
Add specimen-type figure to the basic test plans (Turkish and English)
Shows the straight specimen, the back-to-back pair with its offset,
contact length and connections, the open-end specimen, and the witness
strips above and in the oil inside the aging vessel. Both plans stay at
five pages.

Co-Authored-By: Claude Opus 5.5 <noreply@anthropic.com>
Claude-Session: https://claude.ai/code/session_01BvXxbcg7cqwc3TvyomY2Mh
</commit_message>
<xml_diff>
--- a/reports/Hairpin insulation basic test plan.docx
+++ b/reports/Hairpin insulation basic test plan.docx
@@ -1981,130 +1981,6 @@
     </w:p>
     <w:p>
       <w:pPr>
-        <w:pStyle w:val="ListParagraph"/>
-        <w:numPr>
-          <w:ilvl w:val="0"/>
-          <w:numId w:val="2"/>
-        </w:numPr>
-        <w:spacing w:after="60"/>
-      </w:pPr>
-      <w:r>
-        <w:rPr>
-          <w:b/>
-          <w:bCs/>
-          <w:sz w:val="20"/>
-          <w:szCs w:val="20"/>
-        </w:rPr>
-        <w:t xml:space="preserve">Straight specimen:</w:t>
-      </w:r>
-      <w:r>
-        <w:rPr>
-          <w:sz w:val="20"/>
-          <w:szCs w:val="20"/>
-        </w:rPr>
-        <w:t xml:space="preserve"> 300 mm. One end is stripped 15 mm for connection; the other end and the insulation edge at the stripped end are sealed with oil-resistant epoxy. Photographs, mass/thickness and BDV are done on these specimens.</w:t>
-      </w:r>
-    </w:p>
-    <w:p>
-      <w:pPr>
-        <w:pStyle w:val="ListParagraph"/>
-        <w:numPr>
-          <w:ilvl w:val="0"/>
-          <w:numId w:val="2"/>
-        </w:numPr>
-        <w:spacing w:after="60"/>
-      </w:pPr>
-      <w:r>
-        <w:rPr>
-          <w:b/>
-          <w:bCs/>
-          <w:sz w:val="20"/>
-          <w:szCs w:val="20"/>
-        </w:rPr>
-        <w:t xml:space="preserve">Back-to-back pair:</w:t>
-      </w:r>
-      <w:r>
-        <w:rPr>
-          <w:sz w:val="20"/>
-          <w:szCs w:val="20"/>
-        </w:rPr>
-        <w:t xml:space="preserve"> two straight specimens are laid with their wide faces together, offset by 150 mm; the contact length is 150 mm and the stripped ends point outward. The pair is joined with PTFE tape or a clamp only during measurement; during aging the specimens are kept apart. At every measurement the same two specimens are joined in the same position. Used for insulation resistance and PDIV.</w:t>
-      </w:r>
-    </w:p>
-    <w:p>
-      <w:pPr>
-        <w:pStyle w:val="ListParagraph"/>
-        <w:numPr>
-          <w:ilvl w:val="0"/>
-          <w:numId w:val="2"/>
-        </w:numPr>
-        <w:spacing w:after="60"/>
-      </w:pPr>
-      <w:r>
-        <w:rPr>
-          <w:b/>
-          <w:bCs/>
-          <w:sz w:val="20"/>
-          <w:szCs w:val="20"/>
-        </w:rPr>
-        <w:t xml:space="preserve">Open-end specimen:</w:t>
-      </w:r>
-      <w:r>
-        <w:rPr>
-          <w:sz w:val="20"/>
-          <w:szCs w:val="20"/>
-        </w:rPr>
-        <w:t xml:space="preserve"> 300 mm; one end left open and stripped 20 mm. Used to photograph corrosion at the cut end.</w:t>
-      </w:r>
-    </w:p>
-    <w:p>
-      <w:pPr>
-        <w:pStyle w:val="ListParagraph"/>
-        <w:numPr>
-          <w:ilvl w:val="0"/>
-          <w:numId w:val="2"/>
-        </w:numPr>
-        <w:spacing w:after="60"/>
-      </w:pPr>
-      <w:r>
-        <w:rPr>
-          <w:b/>
-          <w:bCs/>
-          <w:sz w:val="20"/>
-          <w:szCs w:val="20"/>
-        </w:rPr>
-        <w:t xml:space="preserve">Copper witness strip:</w:t>
-      </w:r>
-      <w:r>
-        <w:rPr>
-          <w:sz w:val="20"/>
-          <w:szCs w:val="20"/>
-        </w:rPr>
-        <w:t xml:space="preserve"> bare copper, 6 × 25 mm; 3 pairs in each oil vessel, with one strip of each pair in the oil and one above it. Shows how corrosive the oil is.</w:t>
-      </w:r>
-    </w:p>
-    <w:p>
-      <w:pPr>
-        <w:keepNext w:val="false"/>
-      </w:pPr>
-      <w:r>
-        <w:rPr>
-          <w:sz w:val="20"/>
-          <w:szCs w:val="20"/>
-        </w:rPr>
-        <w:t xml:space="preserve">Preparation: specimens are handled with nitrile gloves, wiped with isopropanol in the same way for all families, and marked with an oil-resistant code. Before measurement they are kept at 23 ± 2 °C and 50 ± 5% relative humidity for at least 24 h.</w:t>
-      </w:r>
-    </w:p>
-    <w:p>
-      <w:pPr>
-        <w:pStyle w:val="Heading1"/>
-      </w:pPr>
-      <w:r>
-        <w:t xml:space="preserve">2. Test flow</w:t>
-      </w:r>
-    </w:p>
-    <w:p>
-      <w:pPr>
         <w:keepNext/>
         <w:spacing w:after="60" w:before="120"/>
         <w:jc w:val="center"/>
@@ -2112,7 +1988,7 @@
       <w:r>
         <w:drawing>
           <wp:inline distT="0" distB="0" distL="0" distR="0">
-            <wp:extent cx="6096000" cy="2533650"/>
+            <wp:extent cx="6096000" cy="3324225"/>
             <wp:effectExtent t="0" r="0" b="0" l="0"/>
             <wp:docPr id="1" name="" descr="" title=""/>
             <wp:cNvGraphicFramePr>
@@ -2137,6 +2013,193 @@
                   <pic:spPr bwMode="auto">
                     <a:xfrm>
                       <a:off x="0" y="0"/>
+                      <a:ext cx="6096000" cy="3324225"/>
+                    </a:xfrm>
+                    <a:prstGeom prst="rect">
+                      <a:avLst/>
+                    </a:prstGeom>
+                  </pic:spPr>
+                </pic:pic>
+              </a:graphicData>
+            </a:graphic>
+          </wp:inline>
+        </w:drawing>
+      </w:r>
+    </w:p>
+    <w:p>
+      <w:pPr>
+        <w:spacing w:after="200"/>
+        <w:jc w:val="center"/>
+      </w:pPr>
+      <w:r>
+        <w:rPr>
+          <w:i/>
+          <w:iCs/>
+          <w:color w:val="595959"/>
+          <w:sz w:val="18"/>
+          <w:szCs w:val="18"/>
+        </w:rPr>
+        <w:t xml:space="preserve">Figure 1. Specimen types</w:t>
+      </w:r>
+    </w:p>
+    <w:p>
+      <w:pPr>
+        <w:pStyle w:val="ListParagraph"/>
+        <w:numPr>
+          <w:ilvl w:val="0"/>
+          <w:numId w:val="2"/>
+        </w:numPr>
+        <w:spacing w:after="60"/>
+      </w:pPr>
+      <w:r>
+        <w:rPr>
+          <w:b/>
+          <w:bCs/>
+          <w:sz w:val="20"/>
+          <w:szCs w:val="20"/>
+        </w:rPr>
+        <w:t xml:space="preserve">Straight specimen:</w:t>
+      </w:r>
+      <w:r>
+        <w:rPr>
+          <w:sz w:val="20"/>
+          <w:szCs w:val="20"/>
+        </w:rPr>
+        <w:t xml:space="preserve"> 300 mm. One end is stripped 15 mm for connection; the other end and the insulation edge at the stripped end are sealed with oil-resistant epoxy. Photographs, mass/thickness and BDV are done on these specimens.</w:t>
+      </w:r>
+    </w:p>
+    <w:p>
+      <w:pPr>
+        <w:pStyle w:val="ListParagraph"/>
+        <w:numPr>
+          <w:ilvl w:val="0"/>
+          <w:numId w:val="2"/>
+        </w:numPr>
+        <w:spacing w:after="60"/>
+      </w:pPr>
+      <w:r>
+        <w:rPr>
+          <w:b/>
+          <w:bCs/>
+          <w:sz w:val="20"/>
+          <w:szCs w:val="20"/>
+        </w:rPr>
+        <w:t xml:space="preserve">Back-to-back pair:</w:t>
+      </w:r>
+      <w:r>
+        <w:rPr>
+          <w:sz w:val="20"/>
+          <w:szCs w:val="20"/>
+        </w:rPr>
+        <w:t xml:space="preserve"> two straight specimens are laid with their wide faces together, offset by 150 mm; the contact length is 150 mm and the stripped ends point outward. The pair is joined with PTFE tape or a clamp only during measurement; during aging the specimens are kept apart. At every measurement the same two specimens are joined in the same position. Used for insulation resistance and PDIV.</w:t>
+      </w:r>
+    </w:p>
+    <w:p>
+      <w:pPr>
+        <w:pStyle w:val="ListParagraph"/>
+        <w:numPr>
+          <w:ilvl w:val="0"/>
+          <w:numId w:val="2"/>
+        </w:numPr>
+        <w:spacing w:after="60"/>
+      </w:pPr>
+      <w:r>
+        <w:rPr>
+          <w:b/>
+          <w:bCs/>
+          <w:sz w:val="20"/>
+          <w:szCs w:val="20"/>
+        </w:rPr>
+        <w:t xml:space="preserve">Open-end specimen:</w:t>
+      </w:r>
+      <w:r>
+        <w:rPr>
+          <w:sz w:val="20"/>
+          <w:szCs w:val="20"/>
+        </w:rPr>
+        <w:t xml:space="preserve"> 300 mm; one end left open and stripped 20 mm. Used to photograph corrosion at the cut end.</w:t>
+      </w:r>
+    </w:p>
+    <w:p>
+      <w:pPr>
+        <w:pStyle w:val="ListParagraph"/>
+        <w:numPr>
+          <w:ilvl w:val="0"/>
+          <w:numId w:val="2"/>
+        </w:numPr>
+        <w:spacing w:after="60"/>
+      </w:pPr>
+      <w:r>
+        <w:rPr>
+          <w:b/>
+          <w:bCs/>
+          <w:sz w:val="20"/>
+          <w:szCs w:val="20"/>
+        </w:rPr>
+        <w:t xml:space="preserve">Copper witness strip:</w:t>
+      </w:r>
+      <w:r>
+        <w:rPr>
+          <w:sz w:val="20"/>
+          <w:szCs w:val="20"/>
+        </w:rPr>
+        <w:t xml:space="preserve"> bare copper, 6 × 25 mm; 3 pairs in each oil vessel, with one strip of each pair in the oil and one above it. Shows how corrosive the oil is.</w:t>
+      </w:r>
+    </w:p>
+    <w:p>
+      <w:pPr>
+        <w:keepNext w:val="false"/>
+      </w:pPr>
+      <w:r>
+        <w:rPr>
+          <w:sz w:val="20"/>
+          <w:szCs w:val="20"/>
+        </w:rPr>
+        <w:t xml:space="preserve">Preparation: specimens are handled with nitrile gloves, wiped with isopropanol in the same way for all families, and marked with an oil-resistant code. Before measurement they are kept at 23 ± 2 °C and 50 ± 5% relative humidity for at least 24 h.</w:t>
+      </w:r>
+    </w:p>
+    <w:p>
+      <w:pPr>
+        <w:pStyle w:val="Heading1"/>
+      </w:pPr>
+      <w:r>
+        <w:t xml:space="preserve">2. Test flow</w:t>
+      </w:r>
+    </w:p>
+    <w:p>
+      <w:pPr>
+        <w:keepNext/>
+        <w:spacing w:after="60" w:before="120"/>
+        <w:jc w:val="center"/>
+      </w:pPr>
+      <w:r>
+        <w:drawing>
+          <wp:inline distT="0" distB="0" distL="0" distR="0">
+            <wp:extent cx="6096000" cy="2533650"/>
+            <wp:effectExtent t="0" r="0" b="0" l="0"/>
+            <wp:docPr id="1" name="" descr="" title=""/>
+            <wp:cNvGraphicFramePr>
+              <a:graphicFrameLocks xmlns:a="http://schemas.openxmlformats.org/drawingml/2006/main" noChangeAspect="1"/>
+            </wp:cNvGraphicFramePr>
+            <a:graphic xmlns:a="http://schemas.openxmlformats.org/drawingml/2006/main">
+              <a:graphicData uri="http://schemas.openxmlformats.org/drawingml/2006/picture">
+                <pic:pic xmlns:pic="http://schemas.openxmlformats.org/drawingml/2006/picture">
+                  <pic:nvPicPr>
+                    <pic:cNvPr id="0" name="" descr=""/>
+                    <pic:cNvPicPr>
+                      <a:picLocks noChangeAspect="1" noChangeArrowheads="1"/>
+                    </pic:cNvPicPr>
+                  </pic:nvPicPr>
+                  <pic:blipFill>
+                    <a:blip r:embed="rId12" cstate="none"/>
+                    <a:srcRect/>
+                    <a:stretch>
+                      <a:fillRect/>
+                    </a:stretch>
+                  </pic:blipFill>
+                  <pic:spPr bwMode="auto">
+                    <a:xfrm>
+                      <a:off x="0" y="0"/>
                       <a:ext cx="6096000" cy="2533650"/>
                     </a:xfrm>
                     <a:prstGeom prst="rect">
@@ -2163,7 +2226,7 @@
           <w:sz w:val="18"/>
           <w:szCs w:val="18"/>
         </w:rPr>
-        <w:t xml:space="preserve">Figure 1. Basic test flow</w:t>
+        <w:t xml:space="preserve">Figure 2. Basic test flow</w:t>
       </w:r>
     </w:p>
     <w:p>

</xml_diff>

<commit_message>
Explain why specimen ends are sealed or left open in the basic test plans
Adds a short rationale: cut ends would let oil under the insulation and
skew the results, so straight specimens are sealed with oil- and
150 °C-resistant epoxy, while the open-end specimen deliberately mimics
the stripped weld end of a hairpin. The open-end specimen's other end is
now stated as sealed, epoxy blanks correct the mass results for the
epoxy's own change, and the figure labels the open-end specimen as the
weld-end case. Both plans stay at five pages.

Co-Authored-By: Claude Opus 5.5 <noreply@anthropic.com>
Claude-Session: https://claude.ai/code/session_01BvXxbcg7cqwc3TvyomY2Mh
</commit_message>
<xml_diff>
--- a/reports/Hairpin insulation basic test plan.docx
+++ b/reports/Hairpin insulation basic test plan.docx
@@ -1952,7 +1952,7 @@
     </w:tbl>
     <w:p>
       <w:pPr>
-        <w:spacing w:after="120" w:before="0"/>
+        <w:spacing w:after="0" w:before="0" w:line="160" w:lineRule="exact"/>
       </w:pPr>
     </w:p>
     <w:p>
@@ -2117,7 +2117,7 @@
           <w:sz w:val="20"/>
           <w:szCs w:val="20"/>
         </w:rPr>
-        <w:t xml:space="preserve"> 300 mm; one end left open and stripped 20 mm. Used to photograph corrosion at the cut end.</w:t>
+        <w:t xml:space="preserve"> 300 mm. One end is stripped 20 mm and its insulation edge is left open; the other end is sealed with epoxy. Represents the stripped weld end in the motor; corrosion at the cut end is photographed.</w:t>
       </w:r>
     </w:p>
     <w:p>
@@ -2144,6 +2144,27 @@
           <w:szCs w:val="20"/>
         </w:rPr>
         <w:t xml:space="preserve"> bare copper, 6 × 25 mm; 3 pairs in each oil vessel, with one strip of each pair in the oil and one above it. Shows how corrosive the oil is.</w:t>
+      </w:r>
+    </w:p>
+    <w:p>
+      <w:pPr>
+        <w:keepNext w:val="false"/>
+      </w:pPr>
+      <w:r>
+        <w:rPr>
+          <w:b/>
+          <w:bCs/>
+          <w:sz w:val="20"/>
+          <w:szCs w:val="20"/>
+        </w:rPr>
+        <w:t xml:space="preserve">Why are the ends sealed?</w:t>
+      </w:r>
+      <w:r>
+        <w:rPr>
+          <w:sz w:val="20"/>
+          <w:szCs w:val="20"/>
+        </w:rPr>
+        <w:t xml:space="preserve"> A specimen is cut from wire, so its ends expose the copper and the insulation's cross-section; in the motor's winding the insulation is continuous. Oil gets under the insulation at an open cut end (especially with tape and glass), and the results then reflect the cut end, not the insulation. The straight specimen's ends are therefore sealed with epoxy that withstands oil and 150 °C; the 15 mm stripped part only connects the test lead. In the motor, the insulation ends in the open where hairpin ends are stripped for welding. The open-end specimen represents that region: it shows whether oil enters at the insulation edge and attacks the copper.</w:t>
       </w:r>
     </w:p>
     <w:p>
@@ -3460,7 +3481,7 @@
     </w:tbl>
     <w:p>
       <w:pPr>
-        <w:spacing w:after="120" w:before="0"/>
+        <w:spacing w:after="0" w:before="0" w:line="160" w:lineRule="exact"/>
       </w:pPr>
     </w:p>
     <w:p>
@@ -3595,15 +3616,7 @@
           <w:sz w:val="20"/>
           <w:szCs w:val="20"/>
         </w:rPr>
-        <w:t xml:space="preserve">Results are given as percentage change. A mass gain mostly shows oil uptake; a loss shows material loss.</w:t>
-      </w:r>
-    </w:p>
-    <w:p>
-      <w:pPr>
-        <w:pStyle w:val="Heading2"/>
-      </w:pPr>
-      <w:r>
-        <w:t xml:space="preserve">3.3 Insulation resistance</w:t>
+        <w:t xml:space="preserve">The epoxy's own mass change is corrected for: 3 small epoxy pieces age with the specimens in each vessel and in the oven, and are weighed.</w:t>
       </w:r>
     </w:p>
     <w:p>
@@ -3620,7 +3633,15 @@
           <w:sz w:val="20"/>
           <w:szCs w:val="20"/>
         </w:rPr>
-        <w:t xml:space="preserve">One conductor of the pair is connected to the high-voltage terminal of the megohmmeter and the other to the return terminal.</w:t>
+        <w:t xml:space="preserve">Results are given as percentage change. A mass gain mostly shows oil uptake; a loss shows material loss.</w:t>
+      </w:r>
+    </w:p>
+    <w:p>
+      <w:pPr>
+        <w:pStyle w:val="Heading2"/>
+      </w:pPr>
+      <w:r>
+        <w:t xml:space="preserve">3.3 Insulation resistance</w:t>
       </w:r>
     </w:p>
     <w:p>
@@ -3637,15 +3658,7 @@
           <w:sz w:val="20"/>
           <w:szCs w:val="20"/>
         </w:rPr>
-        <w:t xml:space="preserve">500 V DC is applied and the value at 60 s (R60) is read. The specimen is discharged after the measurement.</w:t>
-      </w:r>
-    </w:p>
-    <w:p>
-      <w:pPr>
-        <w:pStyle w:val="Heading2"/>
-      </w:pPr>
-      <w:r>
-        <w:t xml:space="preserve">3.4 PDIV and PDEV</w:t>
+        <w:t xml:space="preserve">One conductor of the pair is connected to the high-voltage terminal of the megohmmeter and the other to the return terminal.</w:t>
       </w:r>
     </w:p>
     <w:p>
@@ -3662,7 +3675,15 @@
           <w:sz w:val="20"/>
           <w:szCs w:val="20"/>
         </w:rPr>
-        <w:t xml:space="preserve">The partial discharge measuring system is calibrated with a charge calibrator at the start of each session. Background noise must be below 5 pC.</w:t>
+        <w:t xml:space="preserve">500 V DC is applied and the value at 60 s (R60) is read. The specimen is discharged after the measurement.</w:t>
+      </w:r>
+    </w:p>
+    <w:p>
+      <w:pPr>
+        <w:pStyle w:val="Heading2"/>
+      </w:pPr>
+      <w:r>
+        <w:t xml:space="preserve">3.4 PDIV and PDEV</w:t>
       </w:r>
     </w:p>
     <w:p>
@@ -3679,7 +3700,7 @@
           <w:sz w:val="20"/>
           <w:szCs w:val="20"/>
         </w:rPr>
-        <w:t xml:space="preserve">A 50 Hz AC voltage is applied between the two conductors of the pair and raised from zero at about 50 V/s.</w:t>
+        <w:t xml:space="preserve">The partial discharge measuring system is calibrated with a charge calibrator at the start of each session. Background noise must be below 5 pC.</w:t>
       </w:r>
     </w:p>
     <w:p>
@@ -3696,7 +3717,7 @@
           <w:sz w:val="20"/>
           <w:szCs w:val="20"/>
         </w:rPr>
-        <w:t xml:space="preserve">The voltage at which partial discharge exceeds 10 pC is read as PDIV. The voltage is then lowered at the same rate; the voltage at which discharge falls below 10 pC is read as PDEV.</w:t>
+        <w:t xml:space="preserve">A 50 Hz AC voltage is applied between the two conductors of the pair and raised from zero at about 50 V/s.</w:t>
       </w:r>
     </w:p>
     <w:p>
@@ -3713,7 +3734,7 @@
           <w:sz w:val="20"/>
           <w:szCs w:val="20"/>
         </w:rPr>
-        <w:t xml:space="preserve">The voltage is raised to at most 3.5 kV rms (≈9.9 kVpp), which covers the highest target (1600 V, P/P). If there is no discharge up to this value, the result is recorded as "&gt; 3.5 kV rms".</w:t>
+        <w:t xml:space="preserve">The voltage at which partial discharge exceeds 10 pC is read as PDIV. The voltage is then lowered at the same rate; the voltage at which discharge falls below 10 pC is read as PDEV.</w:t>
       </w:r>
     </w:p>
     <w:p>
@@ -3730,15 +3751,7 @@
           <w:sz w:val="20"/>
           <w:szCs w:val="20"/>
         </w:rPr>
-        <w:t xml:space="preserve">Three readings are taken on each pair, 60 s apart; the mean and the lowest value are recorded. Values are reported in Vrms and Vpp (= Vrms × 2√2).</w:t>
-      </w:r>
-    </w:p>
-    <w:p>
-      <w:pPr>
-        <w:pStyle w:val="Heading2"/>
-      </w:pPr>
-      <w:r>
-        <w:t xml:space="preserve">3.5 Breakdown voltage (BDV)</w:t>
+        <w:t xml:space="preserve">The voltage is raised to at most 3.5 kV rms (≈9.9 kVpp), which covers the highest target (1600 V, P/P). If there is no discharge up to this value, the result is recorded as "&gt; 3.5 kV rms".</w:t>
       </w:r>
     </w:p>
     <w:p>
@@ -3755,7 +3768,15 @@
           <w:sz w:val="20"/>
           <w:szCs w:val="20"/>
         </w:rPr>
-        <w:t xml:space="preserve">This is a destructive test; a tested specimen is not reused.</w:t>
+        <w:t xml:space="preserve">Three readings are taken on each pair, 60 s apart; the mean and the lowest value are recorded. Values are reported in Vrms and Vpp (= Vrms × 2√2).</w:t>
+      </w:r>
+    </w:p>
+    <w:p>
+      <w:pPr>
+        <w:pStyle w:val="Heading2"/>
+      </w:pPr>
+      <w:r>
+        <w:t xml:space="preserve">3.5 Breakdown voltage (BDV)</w:t>
       </w:r>
     </w:p>
     <w:p>
@@ -3772,7 +3793,7 @@
           <w:sz w:val="20"/>
           <w:szCs w:val="20"/>
         </w:rPr>
-        <w:t xml:space="preserve">The straight specimen is tested with the rectangular-wire arrangement of IEC 60851-5: it is embedded in metal shot, or its middle section is wrapped in metal foil. The ends stay outside the electrode.</w:t>
+        <w:t xml:space="preserve">This is a destructive test; a tested specimen is not reused.</w:t>
       </w:r>
     </w:p>
     <w:p>
@@ -3789,7 +3810,7 @@
           <w:sz w:val="20"/>
           <w:szCs w:val="20"/>
         </w:rPr>
-        <w:t xml:space="preserve">A 50 Hz AC voltage is applied between the conductor and the shot or foil and raised at the rate given in the standard (e.g., 500 V/s) until breakdown.</w:t>
+        <w:t xml:space="preserve">The straight specimen is tested with the rectangular-wire arrangement of IEC 60851-5: it is embedded in metal shot, or its middle section is wrapped in metal foil. The ends stay outside the electrode.</w:t>
       </w:r>
     </w:p>
     <w:p>
@@ -3806,15 +3827,7 @@
           <w:sz w:val="20"/>
           <w:szCs w:val="20"/>
         </w:rPr>
-        <w:t xml:space="preserve">Five specimens are tested at the start, and five per arm at each measurement point; the mean, the lowest value and the breakdown location are recorded.</w:t>
-      </w:r>
-    </w:p>
-    <w:p>
-      <w:pPr>
-        <w:pStyle w:val="Heading2"/>
-      </w:pPr>
-      <w:r>
-        <w:t xml:space="preserve">3.6 Oil and witness strips</w:t>
+        <w:t xml:space="preserve">A 50 Hz AC voltage is applied between the conductor and the shot or foil and raised at the rate given in the standard (e.g., 500 V/s) until breakdown.</w:t>
       </w:r>
     </w:p>
     <w:p>
@@ -3831,7 +3844,15 @@
           <w:sz w:val="20"/>
           <w:szCs w:val="20"/>
         </w:rPr>
-        <w:t xml:space="preserve">The water content of the oil is measured by Karl Fischer titration: in fresh oil, and at each measurement point from the oil vessels. The sample is taken into a dry, closed bottle once the vessel has cooled.</w:t>
+        <w:t xml:space="preserve">Five specimens are tested at the start, and five per arm at each measurement point; the mean, the lowest value and the breakdown location are recorded.</w:t>
+      </w:r>
+    </w:p>
+    <w:p>
+      <w:pPr>
+        <w:pStyle w:val="Heading2"/>
+      </w:pPr>
+      <w:r>
+        <w:t xml:space="preserve">3.6 Oil and witness strips</w:t>
       </w:r>
     </w:p>
     <w:p>
@@ -3848,7 +3869,24 @@
           <w:sz w:val="20"/>
           <w:szCs w:val="20"/>
         </w:rPr>
-        <w:t xml:space="preserve">After 2000 h, 100 mL of oil from each vessel is kept in a dark glass bottle; acidity or metal analysis can be ordered later if needed.</w:t>
+        <w:t xml:space="preserve">The water content of the oil is measured by Karl Fischer titration: in fresh oil, and at each measurement point from the oil vessels. The sample is taken into a dry, closed bottle once the vessel has cooled.</w:t>
+      </w:r>
+    </w:p>
+    <w:p>
+      <w:pPr>
+        <w:pStyle w:val="ListParagraph"/>
+        <w:numPr>
+          <w:ilvl w:val="0"/>
+          <w:numId w:val="2"/>
+        </w:numPr>
+        <w:spacing w:after="60"/>
+      </w:pPr>
+      <w:r>
+        <w:rPr>
+          <w:sz w:val="20"/>
+          <w:szCs w:val="20"/>
+        </w:rPr>
+        <w:t xml:space="preserve">After 2000 h, 100 mL of oil per vessel is kept in a dark glass bottle for possible later analysis.</w:t>
       </w:r>
     </w:p>
     <w:p>
@@ -4306,7 +4344,7 @@
     </w:tbl>
     <w:p>
       <w:pPr>
-        <w:spacing w:after="120" w:before="0"/>
+        <w:spacing w:after="0" w:before="0" w:line="160" w:lineRule="exact"/>
       </w:pPr>
     </w:p>
     <w:p>
@@ -4357,7 +4395,7 @@
           <w:sz w:val="20"/>
           <w:szCs w:val="20"/>
         </w:rPr>
-        <w:t xml:space="preserve">Each vessel has pressure relief and a PTFE gasket. Oil fills 65–75% of the vessel; specimens take up at most 5% of the vessel volume.</w:t>
+        <w:t xml:space="preserve">Each vessel has pressure relief and a PTFE gasket. Oil fills 65–75% of it; specimens take up at most 5% of its volume.</w:t>
       </w:r>
     </w:p>
     <w:p>
@@ -5300,7 +5338,7 @@
     </w:tbl>
     <w:p>
       <w:pPr>
-        <w:spacing w:after="120" w:before="0"/>
+        <w:spacing w:after="0" w:before="0" w:line="160" w:lineRule="exact"/>
       </w:pPr>
     </w:p>
     <w:p>
@@ -5818,7 +5856,7 @@
     </w:tbl>
     <w:p>
       <w:pPr>
-        <w:spacing w:after="120" w:before="0"/>
+        <w:spacing w:after="0" w:before="0" w:line="160" w:lineRule="exact"/>
       </w:pPr>
     </w:p>
     <w:p>
@@ -5842,7 +5880,7 @@
           <w:sz w:val="20"/>
           <w:szCs w:val="20"/>
         </w:rPr>
-        <w:t xml:space="preserve">Phase 1 takes about 2 weeks. In Phase 2, 2000 h of aging takes about 12 weeks, and the three measurement points add about 3 weeks. The total is about 17 weeks (≈4 months). Group B follows the same schedule once its materials arrive.</w:t>
+        <w:t xml:space="preserve">Phase 1 takes about 2 weeks. In Phase 2, 2000 h of aging takes about 12 weeks and the three measurement points add about 3 weeks. The total is about 17 weeks (≈4 months); Group B follows the same schedule.</w:t>
       </w:r>
     </w:p>
     <w:p>
@@ -5879,9 +5917,9 @@
         <w:tblLayout w:type="fixed"/>
       </w:tblPr>
       <w:tblGrid>
-        <w:gridCol w:w="2710"/>
-        <w:gridCol w:w="4447"/>
-        <w:gridCol w:w="2481"/>
+        <w:gridCol w:w="2827"/>
+        <w:gridCol w:w="4645"/>
+        <w:gridCol w:w="2166"/>
       </w:tblGrid>
       <w:tr>
         <w:trPr>
@@ -5890,7 +5928,7 @@
         </w:trPr>
         <w:tc>
           <w:tcPr>
-            <w:tcW w:type="dxa" w:w="2710"/>
+            <w:tcW w:type="dxa" w:w="2827"/>
             <w:tcBorders>
               <w:top w:val="single" w:color="BFBFBF" w:sz="4"/>
               <w:left w:val="single" w:color="BFBFBF" w:sz="4"/>
@@ -5924,7 +5962,7 @@
         </w:tc>
         <w:tc>
           <w:tcPr>
-            <w:tcW w:type="dxa" w:w="4447"/>
+            <w:tcW w:type="dxa" w:w="4645"/>
             <w:tcBorders>
               <w:top w:val="single" w:color="BFBFBF" w:sz="4"/>
               <w:left w:val="single" w:color="BFBFBF" w:sz="4"/>
@@ -5958,7 +5996,7 @@
         </w:tc>
         <w:tc>
           <w:tcPr>
-            <w:tcW w:type="dxa" w:w="2481"/>
+            <w:tcW w:type="dxa" w:w="2166"/>
             <w:tcBorders>
               <w:top w:val="single" w:color="BFBFBF" w:sz="4"/>
               <w:left w:val="single" w:color="BFBFBF" w:sz="4"/>
@@ -5997,7 +6035,7 @@
         </w:trPr>
         <w:tc>
           <w:tcPr>
-            <w:tcW w:type="dxa" w:w="2710"/>
+            <w:tcW w:type="dxa" w:w="2827"/>
             <w:tcBorders>
               <w:top w:val="single" w:color="BFBFBF" w:sz="4"/>
               <w:left w:val="single" w:color="BFBFBF" w:sz="4"/>
@@ -6030,63 +6068,63 @@
         </w:tc>
         <w:tc>
           <w:tcPr>
-            <w:tcW w:type="dxa" w:w="4447"/>
-            <w:tcBorders>
-              <w:top w:val="single" w:color="BFBFBF" w:sz="4"/>
-              <w:left w:val="single" w:color="BFBFBF" w:sz="4"/>
-              <w:bottom w:val="single" w:color="BFBFBF" w:sz="4"/>
-              <w:right w:val="single" w:color="BFBFBF" w:sz="4"/>
-            </w:tcBorders>
-            <w:tcMar>
-              <w:top w:type="dxa" w:w="30"/>
-              <w:left w:type="dxa" w:w="80"/>
-              <w:bottom w:type="dxa" w:w="30"/>
-              <w:right w:type="dxa" w:w="80"/>
-            </w:tcMar>
-            <w:vAlign w:val="top"/>
-          </w:tcPr>
-          <w:p>
-            <w:pPr>
-              <w:keepNext/>
-              <w:spacing w:after="0" w:before="0" w:line="240" w:lineRule="auto"/>
-            </w:pPr>
-            <w:r>
-              <w:rPr>
-                <w:sz w:val="16"/>
-                <w:szCs w:val="16"/>
-              </w:rPr>
-              <w:t xml:space="preserve">Needs extra equipment; PDIV and insulation resistance show the basic change</w:t>
-            </w:r>
-          </w:p>
-        </w:tc>
-        <w:tc>
-          <w:tcPr>
-            <w:tcW w:type="dxa" w:w="2481"/>
-            <w:tcBorders>
-              <w:top w:val="single" w:color="BFBFBF" w:sz="4"/>
-              <w:left w:val="single" w:color="BFBFBF" w:sz="4"/>
-              <w:bottom w:val="single" w:color="BFBFBF" w:sz="4"/>
-              <w:right w:val="single" w:color="BFBFBF" w:sz="4"/>
-            </w:tcBorders>
-            <w:tcMar>
-              <w:top w:type="dxa" w:w="30"/>
-              <w:left w:type="dxa" w:w="80"/>
-              <w:bottom w:type="dxa" w:w="30"/>
-              <w:right w:type="dxa" w:w="80"/>
-            </w:tcMar>
-            <w:vAlign w:val="top"/>
-          </w:tcPr>
-          <w:p>
-            <w:pPr>
-              <w:keepNext/>
-              <w:spacing w:after="0" w:before="0" w:line="240" w:lineRule="auto"/>
-            </w:pPr>
-            <w:r>
-              <w:rPr>
-                <w:sz w:val="16"/>
-                <w:szCs w:val="16"/>
-              </w:rPr>
-              <w:t xml:space="preserve">With an LCR meter on the same pairs</w:t>
+            <w:tcW w:type="dxa" w:w="4645"/>
+            <w:tcBorders>
+              <w:top w:val="single" w:color="BFBFBF" w:sz="4"/>
+              <w:left w:val="single" w:color="BFBFBF" w:sz="4"/>
+              <w:bottom w:val="single" w:color="BFBFBF" w:sz="4"/>
+              <w:right w:val="single" w:color="BFBFBF" w:sz="4"/>
+            </w:tcBorders>
+            <w:tcMar>
+              <w:top w:type="dxa" w:w="30"/>
+              <w:left w:type="dxa" w:w="80"/>
+              <w:bottom w:type="dxa" w:w="30"/>
+              <w:right w:type="dxa" w:w="80"/>
+            </w:tcMar>
+            <w:vAlign w:val="top"/>
+          </w:tcPr>
+          <w:p>
+            <w:pPr>
+              <w:keepNext/>
+              <w:spacing w:after="0" w:before="0" w:line="240" w:lineRule="auto"/>
+            </w:pPr>
+            <w:r>
+              <w:rPr>
+                <w:sz w:val="16"/>
+                <w:szCs w:val="16"/>
+              </w:rPr>
+              <w:t xml:space="preserve">Extra equipment; PDIV and resistance show the basic change</w:t>
+            </w:r>
+          </w:p>
+        </w:tc>
+        <w:tc>
+          <w:tcPr>
+            <w:tcW w:type="dxa" w:w="2166"/>
+            <w:tcBorders>
+              <w:top w:val="single" w:color="BFBFBF" w:sz="4"/>
+              <w:left w:val="single" w:color="BFBFBF" w:sz="4"/>
+              <w:bottom w:val="single" w:color="BFBFBF" w:sz="4"/>
+              <w:right w:val="single" w:color="BFBFBF" w:sz="4"/>
+            </w:tcBorders>
+            <w:tcMar>
+              <w:top w:type="dxa" w:w="30"/>
+              <w:left w:type="dxa" w:w="80"/>
+              <w:bottom w:type="dxa" w:w="30"/>
+              <w:right w:type="dxa" w:w="80"/>
+            </w:tcMar>
+            <w:vAlign w:val="top"/>
+          </w:tcPr>
+          <w:p>
+            <w:pPr>
+              <w:keepNext/>
+              <w:spacing w:after="0" w:before="0" w:line="240" w:lineRule="auto"/>
+            </w:pPr>
+            <w:r>
+              <w:rPr>
+                <w:sz w:val="16"/>
+                <w:szCs w:val="16"/>
+              </w:rPr>
+              <w:t xml:space="preserve">LCR meter, same pairs</w:t>
             </w:r>
           </w:p>
         </w:tc>
@@ -6097,7 +6135,7 @@
         </w:trPr>
         <w:tc>
           <w:tcPr>
-            <w:tcW w:type="dxa" w:w="2710"/>
+            <w:tcW w:type="dxa" w:w="2827"/>
             <w:tcBorders>
               <w:top w:val="single" w:color="BFBFBF" w:sz="4"/>
               <w:left w:val="single" w:color="BFBFBF" w:sz="4"/>
@@ -6131,7 +6169,7 @@
         </w:tc>
         <w:tc>
           <w:tcPr>
-            <w:tcW w:type="dxa" w:w="4447"/>
+            <w:tcW w:type="dxa" w:w="4645"/>
             <w:tcBorders>
               <w:top w:val="single" w:color="BFBFBF" w:sz="4"/>
               <w:left w:val="single" w:color="BFBFBF" w:sz="4"/>
@@ -6163,7 +6201,7 @@
         </w:tc>
         <w:tc>
           <w:tcPr>
-            <w:tcW w:type="dxa" w:w="2481"/>
+            <w:tcW w:type="dxa" w:w="2166"/>
             <w:tcBorders>
               <w:top w:val="single" w:color="BFBFBF" w:sz="4"/>
               <w:left w:val="single" w:color="BFBFBF" w:sz="4"/>
@@ -6200,7 +6238,7 @@
         </w:trPr>
         <w:tc>
           <w:tcPr>
-            <w:tcW w:type="dxa" w:w="2710"/>
+            <w:tcW w:type="dxa" w:w="2827"/>
             <w:tcBorders>
               <w:top w:val="single" w:color="BFBFBF" w:sz="4"/>
               <w:left w:val="single" w:color="BFBFBF" w:sz="4"/>
@@ -6233,7 +6271,7 @@
         </w:tc>
         <w:tc>
           <w:tcPr>
-            <w:tcW w:type="dxa" w:w="4447"/>
+            <w:tcW w:type="dxa" w:w="4645"/>
             <w:tcBorders>
               <w:top w:val="single" w:color="BFBFBF" w:sz="4"/>
               <w:left w:val="single" w:color="BFBFBF" w:sz="4"/>
@@ -6264,7 +6302,7 @@
         </w:tc>
         <w:tc>
           <w:tcPr>
-            <w:tcW w:type="dxa" w:w="2481"/>
+            <w:tcW w:type="dxa" w:w="2166"/>
             <w:tcBorders>
               <w:top w:val="single" w:color="BFBFBF" w:sz="4"/>
               <w:left w:val="single" w:color="BFBFBF" w:sz="4"/>
@@ -6300,7 +6338,7 @@
         </w:trPr>
         <w:tc>
           <w:tcPr>
-            <w:tcW w:type="dxa" w:w="2710"/>
+            <w:tcW w:type="dxa" w:w="2827"/>
             <w:tcBorders>
               <w:top w:val="single" w:color="BFBFBF" w:sz="4"/>
               <w:left w:val="single" w:color="BFBFBF" w:sz="4"/>
@@ -6328,13 +6366,13 @@
                 <w:sz w:val="16"/>
                 <w:szCs w:val="16"/>
               </w:rPr>
-              <w:t xml:space="preserve">Phase-to-ground and gapped phase-to-phase PDIV</w:t>
-            </w:r>
-          </w:p>
-        </w:tc>
-        <w:tc>
-          <w:tcPr>
-            <w:tcW w:type="dxa" w:w="4447"/>
+              <w:t xml:space="preserve">Phase-to-ground and gapped P/P PDIV</w:t>
+            </w:r>
+          </w:p>
+        </w:tc>
+        <w:tc>
+          <w:tcPr>
+            <w:tcW w:type="dxa" w:w="4645"/>
             <w:tcBorders>
               <w:top w:val="single" w:color="BFBFBF" w:sz="4"/>
               <w:left w:val="single" w:color="BFBFBF" w:sz="4"/>
@@ -6366,7 +6404,7 @@
         </w:tc>
         <w:tc>
           <w:tcPr>
-            <w:tcW w:type="dxa" w:w="2481"/>
+            <w:tcW w:type="dxa" w:w="2166"/>
             <w:tcBorders>
               <w:top w:val="single" w:color="BFBFBF" w:sz="4"/>
               <w:left w:val="single" w:color="BFBFBF" w:sz="4"/>
@@ -6403,7 +6441,7 @@
         </w:trPr>
         <w:tc>
           <w:tcPr>
-            <w:tcW w:type="dxa" w:w="2710"/>
+            <w:tcW w:type="dxa" w:w="2827"/>
             <w:tcBorders>
               <w:top w:val="single" w:color="BFBFBF" w:sz="4"/>
               <w:left w:val="single" w:color="BFBFBF" w:sz="4"/>
@@ -6436,7 +6474,7 @@
         </w:tc>
         <w:tc>
           <w:tcPr>
-            <w:tcW w:type="dxa" w:w="4447"/>
+            <w:tcW w:type="dxa" w:w="4645"/>
             <w:tcBorders>
               <w:top w:val="single" w:color="BFBFBF" w:sz="4"/>
               <w:left w:val="single" w:color="BFBFBF" w:sz="4"/>
@@ -6467,32 +6505,32 @@
         </w:tc>
         <w:tc>
           <w:tcPr>
-            <w:tcW w:type="dxa" w:w="2481"/>
-            <w:tcBorders>
-              <w:top w:val="single" w:color="BFBFBF" w:sz="4"/>
-              <w:left w:val="single" w:color="BFBFBF" w:sz="4"/>
-              <w:bottom w:val="single" w:color="BFBFBF" w:sz="4"/>
-              <w:right w:val="single" w:color="BFBFBF" w:sz="4"/>
-            </w:tcBorders>
-            <w:tcMar>
-              <w:top w:type="dxa" w:w="30"/>
-              <w:left w:type="dxa" w:w="80"/>
-              <w:bottom w:type="dxa" w:w="30"/>
-              <w:right w:type="dxa" w:w="80"/>
-            </w:tcMar>
-            <w:vAlign w:val="top"/>
-          </w:tcPr>
-          <w:p>
-            <w:pPr>
-              <w:keepNext/>
-              <w:spacing w:after="0" w:before="0" w:line="240" w:lineRule="auto"/>
-            </w:pPr>
-            <w:r>
-              <w:rPr>
-                <w:sz w:val="16"/>
-                <w:szCs w:val="16"/>
-              </w:rPr>
-              <w:t xml:space="preserve">Witness strips partly track the vapor phase</w:t>
+            <w:tcW w:type="dxa" w:w="2166"/>
+            <w:tcBorders>
+              <w:top w:val="single" w:color="BFBFBF" w:sz="4"/>
+              <w:left w:val="single" w:color="BFBFBF" w:sz="4"/>
+              <w:bottom w:val="single" w:color="BFBFBF" w:sz="4"/>
+              <w:right w:val="single" w:color="BFBFBF" w:sz="4"/>
+            </w:tcBorders>
+            <w:tcMar>
+              <w:top w:type="dxa" w:w="30"/>
+              <w:left w:type="dxa" w:w="80"/>
+              <w:bottom w:type="dxa" w:w="30"/>
+              <w:right w:type="dxa" w:w="80"/>
+            </w:tcMar>
+            <w:vAlign w:val="top"/>
+          </w:tcPr>
+          <w:p>
+            <w:pPr>
+              <w:keepNext/>
+              <w:spacing w:after="0" w:before="0" w:line="240" w:lineRule="auto"/>
+            </w:pPr>
+            <w:r>
+              <w:rPr>
+                <w:sz w:val="16"/>
+                <w:szCs w:val="16"/>
+              </w:rPr>
+              <w:t xml:space="preserve">Witness strips partly cover it</w:t>
             </w:r>
           </w:p>
         </w:tc>
@@ -6503,7 +6541,7 @@
         </w:trPr>
         <w:tc>
           <w:tcPr>
-            <w:tcW w:type="dxa" w:w="2710"/>
+            <w:tcW w:type="dxa" w:w="2827"/>
             <w:tcBorders>
               <w:top w:val="single" w:color="BFBFBF" w:sz="4"/>
               <w:left w:val="single" w:color="BFBFBF" w:sz="4"/>
@@ -6537,7 +6575,7 @@
         </w:tc>
         <w:tc>
           <w:tcPr>
-            <w:tcW w:type="dxa" w:w="4447"/>
+            <w:tcW w:type="dxa" w:w="4645"/>
             <w:tcBorders>
               <w:top w:val="single" w:color="BFBFBF" w:sz="4"/>
               <w:left w:val="single" w:color="BFBFBF" w:sz="4"/>
@@ -6569,7 +6607,7 @@
         </w:tc>
         <w:tc>
           <w:tcPr>
-            <w:tcW w:type="dxa" w:w="2481"/>
+            <w:tcW w:type="dxa" w:w="2166"/>
             <w:tcBorders>
               <w:top w:val="single" w:color="BFBFBF" w:sz="4"/>
               <w:left w:val="single" w:color="BFBFBF" w:sz="4"/>
@@ -6595,7 +6633,7 @@
                 <w:sz w:val="16"/>
                 <w:szCs w:val="16"/>
               </w:rPr>
-              <w:t xml:space="preserve">To see whether oil uptake is reversible</w:t>
+              <w:t xml:space="preserve">Checks if uptake reverses</w:t>
             </w:r>
           </w:p>
         </w:tc>
@@ -6606,7 +6644,7 @@
         </w:trPr>
         <w:tc>
           <w:tcPr>
-            <w:tcW w:type="dxa" w:w="2710"/>
+            <w:tcW w:type="dxa" w:w="2827"/>
             <w:tcBorders>
               <w:top w:val="single" w:color="BFBFBF" w:sz="4"/>
               <w:left w:val="single" w:color="BFBFBF" w:sz="4"/>
@@ -6639,7 +6677,7 @@
         </w:tc>
         <w:tc>
           <w:tcPr>
-            <w:tcW w:type="dxa" w:w="4447"/>
+            <w:tcW w:type="dxa" w:w="4645"/>
             <w:tcBorders>
               <w:top w:val="single" w:color="BFBFBF" w:sz="4"/>
               <w:left w:val="single" w:color="BFBFBF" w:sz="4"/>
@@ -6670,7 +6708,7 @@
         </w:tc>
         <w:tc>
           <w:tcPr>
-            <w:tcW w:type="dxa" w:w="2481"/>
+            <w:tcW w:type="dxa" w:w="2166"/>
             <w:tcBorders>
               <w:top w:val="single" w:color="BFBFBF" w:sz="4"/>
               <w:left w:val="single" w:color="BFBFBF" w:sz="4"/>
@@ -6706,7 +6744,7 @@
         </w:trPr>
         <w:tc>
           <w:tcPr>
-            <w:tcW w:type="dxa" w:w="2710"/>
+            <w:tcW w:type="dxa" w:w="2827"/>
             <w:tcBorders>
               <w:top w:val="single" w:color="BFBFBF" w:sz="4"/>
               <w:left w:val="single" w:color="BFBFBF" w:sz="4"/>
@@ -6740,7 +6778,7 @@
         </w:tc>
         <w:tc>
           <w:tcPr>
-            <w:tcW w:type="dxa" w:w="4447"/>
+            <w:tcW w:type="dxa" w:w="4645"/>
             <w:tcBorders>
               <w:top w:val="single" w:color="BFBFBF" w:sz="4"/>
               <w:left w:val="single" w:color="BFBFBF" w:sz="4"/>
@@ -6772,7 +6810,7 @@
         </w:tc>
         <w:tc>
           <w:tcPr>
-            <w:tcW w:type="dxa" w:w="2481"/>
+            <w:tcW w:type="dxa" w:w="2166"/>
             <w:tcBorders>
               <w:top w:val="single" w:color="BFBFBF" w:sz="4"/>
               <w:left w:val="single" w:color="BFBFBF" w:sz="4"/>
@@ -6809,7 +6847,7 @@
         </w:trPr>
         <w:tc>
           <w:tcPr>
-            <w:tcW w:type="dxa" w:w="2710"/>
+            <w:tcW w:type="dxa" w:w="2827"/>
             <w:tcBorders>
               <w:top w:val="single" w:color="BFBFBF" w:sz="4"/>
               <w:left w:val="single" w:color="BFBFBF" w:sz="4"/>
@@ -6842,7 +6880,7 @@
         </w:tc>
         <w:tc>
           <w:tcPr>
-            <w:tcW w:type="dxa" w:w="4447"/>
+            <w:tcW w:type="dxa" w:w="4645"/>
             <w:tcBorders>
               <w:top w:val="single" w:color="BFBFBF" w:sz="4"/>
               <w:left w:val="single" w:color="BFBFBF" w:sz="4"/>
@@ -6873,7 +6911,7 @@
         </w:tc>
         <w:tc>
           <w:tcPr>
-            <w:tcW w:type="dxa" w:w="2481"/>
+            <w:tcW w:type="dxa" w:w="2166"/>
             <w:tcBorders>
               <w:top w:val="single" w:color="BFBFBF" w:sz="4"/>
               <w:left w:val="single" w:color="BFBFBF" w:sz="4"/>
@@ -6906,7 +6944,7 @@
     </w:tbl>
     <w:p>
       <w:pPr>
-        <w:spacing w:after="120" w:before="0"/>
+        <w:spacing w:after="0" w:before="0" w:line="160" w:lineRule="exact"/>
       </w:pPr>
     </w:p>
     <w:p>

</xml_diff>

<commit_message>
Add process figures to the basic test plans (Turkish and English)
Four new figures: the work sequence at each measurement point, the
electrical set-ups (insulation resistance, the IEC 60270 PDIV circuit,
the PDIV/PDEV voltage profile, BDV with foil electrode), a schematic of
how retention, oil effect and the PDIV class verdict are read, and the
17-week schedule. The text now refers to each figure. Both plans are
seven pages (Draft 5).

Co-Authored-By: Claude Opus 5.5 <noreply@anthropic.com>
Claude-Session: https://claude.ai/code/session_01BvXxbcg7cqwc3TvyomY2Mh
</commit_message>
<xml_diff>
--- a/reports/Hairpin insulation basic test plan.docx
+++ b/reports/Hairpin insulation basic test plan.docx
@@ -53,7 +53,7 @@
           <w:sz w:val="18"/>
           <w:szCs w:val="18"/>
         </w:rPr>
-        <w:t xml:space="preserve">Draft 4 — basic plan</w:t>
+        <w:t xml:space="preserve">Draft 5 — basic plan</w:t>
       </w:r>
       <w:r>
         <w:rPr>
@@ -79,7 +79,7 @@
           <w:sz w:val="18"/>
           <w:szCs w:val="18"/>
         </w:rPr>
-        <w:t xml:space="preserve">20 October 2026</w:t>
+        <w:t xml:space="preserve">21 October 2026</w:t>
       </w:r>
     </w:p>
     <w:p>
@@ -1976,7 +1976,7 @@
           <w:sz w:val="20"/>
           <w:szCs w:val="20"/>
         </w:rPr>
-        <w:t xml:space="preserve">Specimen types:</w:t>
+        <w:t xml:space="preserve">Specimen types (Figure 1):</w:t>
       </w:r>
     </w:p>
     <w:p>
@@ -2370,6 +2370,81 @@
     </w:p>
     <w:p>
       <w:pPr>
+        <w:keepNext/>
+      </w:pPr>
+      <w:r>
+        <w:rPr>
+          <w:sz w:val="20"/>
+          <w:szCs w:val="20"/>
+        </w:rPr>
+        <w:t xml:space="preserve">The work sequence at a measurement point is shown in Figure 3:</w:t>
+      </w:r>
+    </w:p>
+    <w:p>
+      <w:pPr>
+        <w:keepNext/>
+        <w:spacing w:after="60" w:before="120"/>
+        <w:jc w:val="center"/>
+      </w:pPr>
+      <w:r>
+        <w:drawing>
+          <wp:inline distT="0" distB="0" distL="0" distR="0">
+            <wp:extent cx="6096000" cy="2562225"/>
+            <wp:effectExtent t="0" r="0" b="0" l="0"/>
+            <wp:docPr id="1" name="" descr="" title=""/>
+            <wp:cNvGraphicFramePr>
+              <a:graphicFrameLocks xmlns:a="http://schemas.openxmlformats.org/drawingml/2006/main" noChangeAspect="1"/>
+            </wp:cNvGraphicFramePr>
+            <a:graphic xmlns:a="http://schemas.openxmlformats.org/drawingml/2006/main">
+              <a:graphicData uri="http://schemas.openxmlformats.org/drawingml/2006/picture">
+                <pic:pic xmlns:pic="http://schemas.openxmlformats.org/drawingml/2006/picture">
+                  <pic:nvPicPr>
+                    <pic:cNvPr id="0" name="" descr=""/>
+                    <pic:cNvPicPr>
+                      <a:picLocks noChangeAspect="1" noChangeArrowheads="1"/>
+                    </pic:cNvPicPr>
+                  </pic:nvPicPr>
+                  <pic:blipFill>
+                    <a:blip r:embed="rId13" cstate="none"/>
+                    <a:srcRect/>
+                    <a:stretch>
+                      <a:fillRect/>
+                    </a:stretch>
+                  </pic:blipFill>
+                  <pic:spPr bwMode="auto">
+                    <a:xfrm>
+                      <a:off x="0" y="0"/>
+                      <a:ext cx="6096000" cy="2562225"/>
+                    </a:xfrm>
+                    <a:prstGeom prst="rect">
+                      <a:avLst/>
+                    </a:prstGeom>
+                  </pic:spPr>
+                </pic:pic>
+              </a:graphicData>
+            </a:graphic>
+          </wp:inline>
+        </w:drawing>
+      </w:r>
+    </w:p>
+    <w:p>
+      <w:pPr>
+        <w:spacing w:after="200"/>
+        <w:jc w:val="center"/>
+      </w:pPr>
+      <w:r>
+        <w:rPr>
+          <w:i/>
+          <w:iCs/>
+          <w:color w:val="595959"/>
+          <w:sz w:val="18"/>
+          <w:szCs w:val="18"/>
+        </w:rPr>
+        <w:t xml:space="preserve">Figure 3. Work sequence at a measurement point (500, 1000 and 2000 h)</w:t>
+      </w:r>
+    </w:p>
+    <w:p>
+      <w:pPr>
         <w:pStyle w:val="Heading1"/>
       </w:pPr>
       <w:r>
@@ -3638,6 +3713,69 @@
     </w:p>
     <w:p>
       <w:pPr>
+        <w:keepNext/>
+        <w:spacing w:after="60" w:before="120"/>
+        <w:jc w:val="center"/>
+      </w:pPr>
+      <w:r>
+        <w:drawing>
+          <wp:inline distT="0" distB="0" distL="0" distR="0">
+            <wp:extent cx="6096000" cy="3810000"/>
+            <wp:effectExtent t="0" r="0" b="0" l="0"/>
+            <wp:docPr id="1" name="" descr="" title=""/>
+            <wp:cNvGraphicFramePr>
+              <a:graphicFrameLocks xmlns:a="http://schemas.openxmlformats.org/drawingml/2006/main" noChangeAspect="1"/>
+            </wp:cNvGraphicFramePr>
+            <a:graphic xmlns:a="http://schemas.openxmlformats.org/drawingml/2006/main">
+              <a:graphicData uri="http://schemas.openxmlformats.org/drawingml/2006/picture">
+                <pic:pic xmlns:pic="http://schemas.openxmlformats.org/drawingml/2006/picture">
+                  <pic:nvPicPr>
+                    <pic:cNvPr id="0" name="" descr=""/>
+                    <pic:cNvPicPr>
+                      <a:picLocks noChangeAspect="1" noChangeArrowheads="1"/>
+                    </pic:cNvPicPr>
+                  </pic:nvPicPr>
+                  <pic:blipFill>
+                    <a:blip r:embed="rId14" cstate="none"/>
+                    <a:srcRect/>
+                    <a:stretch>
+                      <a:fillRect/>
+                    </a:stretch>
+                  </pic:blipFill>
+                  <pic:spPr bwMode="auto">
+                    <a:xfrm>
+                      <a:off x="0" y="0"/>
+                      <a:ext cx="6096000" cy="3810000"/>
+                    </a:xfrm>
+                    <a:prstGeom prst="rect">
+                      <a:avLst/>
+                    </a:prstGeom>
+                  </pic:spPr>
+                </pic:pic>
+              </a:graphicData>
+            </a:graphic>
+          </wp:inline>
+        </w:drawing>
+      </w:r>
+    </w:p>
+    <w:p>
+      <w:pPr>
+        <w:spacing w:after="200"/>
+        <w:jc w:val="center"/>
+      </w:pPr>
+      <w:r>
+        <w:rPr>
+          <w:i/>
+          <w:iCs/>
+          <w:color w:val="595959"/>
+          <w:sz w:val="18"/>
+          <w:szCs w:val="18"/>
+        </w:rPr>
+        <w:t xml:space="preserve">Figure 4. Electrical test set-ups</w:t>
+      </w:r>
+    </w:p>
+    <w:p>
+      <w:pPr>
         <w:pStyle w:val="Heading2"/>
       </w:pPr>
       <w:r>
@@ -3658,7 +3796,7 @@
           <w:sz w:val="20"/>
           <w:szCs w:val="20"/>
         </w:rPr>
-        <w:t xml:space="preserve">One conductor of the pair is connected to the high-voltage terminal of the megohmmeter and the other to the return terminal.</w:t>
+        <w:t xml:space="preserve">One conductor of the pair is connected to the high-voltage terminal of the megohmmeter and the other to the return terminal (Figure 4a).</w:t>
       </w:r>
     </w:p>
     <w:p>
@@ -3717,7 +3855,7 @@
           <w:sz w:val="20"/>
           <w:szCs w:val="20"/>
         </w:rPr>
-        <w:t xml:space="preserve">A 50 Hz AC voltage is applied between the two conductors of the pair and raised from zero at about 50 V/s.</w:t>
+        <w:t xml:space="preserve">A 50 Hz AC voltage is applied between the two conductors of the pair and raised from zero at about 50 V/s (circuit Figure 4b, profile Figure 4c).</w:t>
       </w:r>
     </w:p>
     <w:p>
@@ -3810,7 +3948,7 @@
           <w:sz w:val="20"/>
           <w:szCs w:val="20"/>
         </w:rPr>
-        <w:t xml:space="preserve">The straight specimen is tested with the rectangular-wire arrangement of IEC 60851-5: it is embedded in metal shot, or its middle section is wrapped in metal foil. The ends stay outside the electrode.</w:t>
+        <w:t xml:space="preserve">The straight specimen is tested with the rectangular-wire arrangement of IEC 60851-5: it is embedded in metal shot, or its middle section is wrapped in metal foil. The ends stay outside the electrode (Figure 4d).</w:t>
       </w:r>
     </w:p>
     <w:p>
@@ -3844,7 +3982,7 @@
           <w:sz w:val="20"/>
           <w:szCs w:val="20"/>
         </w:rPr>
-        <w:t xml:space="preserve">Five specimens are tested at the start, and five per arm at each measurement point; the mean, the lowest value and the breakdown location are recorded.</w:t>
+        <w:t xml:space="preserve">Five specimens are tested at the start and five per arm at each point; the mean, lowest value and failure site are recorded.</w:t>
       </w:r>
     </w:p>
     <w:p>
@@ -4361,7 +4499,7 @@
           <w:sz w:val="20"/>
           <w:szCs w:val="20"/>
         </w:rPr>
-        <w:t xml:space="preserve">The 1000 h point matches the oil-resistance duration of IEC 60851-4 Test 20; 500 and 2000 h show the trend. 150 °C is the upper limit of this test.</w:t>
+        <w:t xml:space="preserve">The 1000 h point is the oil-resistance duration of IEC 60851-4 Test 20 (max. 150 °C); 500 and 2000 h show the trend.</w:t>
       </w:r>
     </w:p>
     <w:p>
@@ -4378,7 +4516,7 @@
           <w:sz w:val="20"/>
           <w:szCs w:val="20"/>
         </w:rPr>
-        <w:t xml:space="preserve">Each family ages in its own vessel, so products released by one insulation do not affect another. All vessels use the same batch of e-oil.</w:t>
+        <w:t xml:space="preserve">Each family ages in its own vessel so products from one insulation do not affect another; all use one e-oil batch.</w:t>
       </w:r>
     </w:p>
     <w:p>
@@ -4395,7 +4533,7 @@
           <w:sz w:val="20"/>
           <w:szCs w:val="20"/>
         </w:rPr>
-        <w:t xml:space="preserve">Each vessel has pressure relief and a PTFE gasket. Oil fills 65–75% of it; specimens take up at most 5% of its volume.</w:t>
+        <w:t xml:space="preserve">Each vessel has pressure relief and a PTFE gasket; oil fills 65–75% of it, specimens at most 5% of its volume.</w:t>
       </w:r>
     </w:p>
     <w:p>
@@ -4466,7 +4604,7 @@
           <w:sz w:val="20"/>
           <w:szCs w:val="20"/>
         </w:rPr>
-        <w:t xml:space="preserve">The main criterion is retention: the value at a measurement point divided by the dry value, on the same specimen. The oil effect is the difference between oil-arm and air-arm retention at the same aging time. Retention is plotted against 500, 1000 and 2000 h to show the trend.</w:t>
+        <w:t xml:space="preserve">The main criterion is retention: the value at a measurement point divided by the dry value, on the same specimen. The oil effect is the difference between oil-arm and air-arm retention at the same aging time. Retention is plotted against 500, 1000 and 2000 h to show the trend (Figure 5a).</w:t>
       </w:r>
     </w:p>
     <w:p>
@@ -5384,7 +5522,7 @@
           <w:sz w:val="20"/>
           <w:szCs w:val="20"/>
         </w:rPr>
-        <w:t xml:space="preserve">The lowest PDIV across the measurement points meets the aged target of the class.</w:t>
+        <w:t xml:space="preserve">The lowest PDIV across the measurement points meets the aged target of the class (reading example: Figure 5b).</w:t>
       </w:r>
     </w:p>
     <w:p>
@@ -5402,6 +5540,69 @@
           <w:szCs w:val="20"/>
         </w:rPr>
         <w:t xml:space="preserve">BDV retention and visual findings (color, cracks, blisters, corrosion at the cut end) are reported.</w:t>
+      </w:r>
+    </w:p>
+    <w:p>
+      <w:pPr>
+        <w:keepNext/>
+        <w:spacing w:after="60" w:before="120"/>
+        <w:jc w:val="center"/>
+      </w:pPr>
+      <w:r>
+        <w:drawing>
+          <wp:inline distT="0" distB="0" distL="0" distR="0">
+            <wp:extent cx="6096000" cy="2286000"/>
+            <wp:effectExtent t="0" r="0" b="0" l="0"/>
+            <wp:docPr id="1" name="" descr="" title=""/>
+            <wp:cNvGraphicFramePr>
+              <a:graphicFrameLocks xmlns:a="http://schemas.openxmlformats.org/drawingml/2006/main" noChangeAspect="1"/>
+            </wp:cNvGraphicFramePr>
+            <a:graphic xmlns:a="http://schemas.openxmlformats.org/drawingml/2006/main">
+              <a:graphicData uri="http://schemas.openxmlformats.org/drawingml/2006/picture">
+                <pic:pic xmlns:pic="http://schemas.openxmlformats.org/drawingml/2006/picture">
+                  <pic:nvPicPr>
+                    <pic:cNvPr id="0" name="" descr=""/>
+                    <pic:cNvPicPr>
+                      <a:picLocks noChangeAspect="1" noChangeArrowheads="1"/>
+                    </pic:cNvPicPr>
+                  </pic:nvPicPr>
+                  <pic:blipFill>
+                    <a:blip r:embed="rId15" cstate="none"/>
+                    <a:srcRect/>
+                    <a:stretch>
+                      <a:fillRect/>
+                    </a:stretch>
+                  </pic:blipFill>
+                  <pic:spPr bwMode="auto">
+                    <a:xfrm>
+                      <a:off x="0" y="0"/>
+                      <a:ext cx="6096000" cy="2286000"/>
+                    </a:xfrm>
+                    <a:prstGeom prst="rect">
+                      <a:avLst/>
+                    </a:prstGeom>
+                  </pic:spPr>
+                </pic:pic>
+              </a:graphicData>
+            </a:graphic>
+          </wp:inline>
+        </w:drawing>
+      </w:r>
+    </w:p>
+    <w:p>
+      <w:pPr>
+        <w:spacing w:after="200"/>
+        <w:jc w:val="center"/>
+      </w:pPr>
+      <w:r>
+        <w:rPr>
+          <w:i/>
+          <w:iCs/>
+          <w:color w:val="595959"/>
+          <w:sz w:val="18"/>
+          <w:szCs w:val="18"/>
+        </w:rPr>
+        <w:t xml:space="preserve">Figure 5. How the evaluation is read (schematic example)</w:t>
       </w:r>
     </w:p>
     <w:p>
@@ -5880,7 +6081,70 @@
           <w:sz w:val="20"/>
           <w:szCs w:val="20"/>
         </w:rPr>
-        <w:t xml:space="preserve">Phase 1 takes about 2 weeks. In Phase 2, 2000 h of aging takes about 12 weeks and the three measurement points add about 3 weeks. The total is about 17 weeks (≈4 months); Group B follows the same schedule.</w:t>
+        <w:t xml:space="preserve">Phase 1 takes about 2 weeks. In Phase 2, 2000 h of aging takes about 12 weeks and the three measurement points add about 3 weeks. The total is about 17 weeks (≈4 months); Group B follows the same schedule (Figure 6).</w:t>
+      </w:r>
+    </w:p>
+    <w:p>
+      <w:pPr>
+        <w:keepNext/>
+        <w:spacing w:after="60" w:before="120"/>
+        <w:jc w:val="center"/>
+      </w:pPr>
+      <w:r>
+        <w:drawing>
+          <wp:inline distT="0" distB="0" distL="0" distR="0">
+            <wp:extent cx="6096000" cy="2000250"/>
+            <wp:effectExtent t="0" r="0" b="0" l="0"/>
+            <wp:docPr id="1" name="" descr="" title=""/>
+            <wp:cNvGraphicFramePr>
+              <a:graphicFrameLocks xmlns:a="http://schemas.openxmlformats.org/drawingml/2006/main" noChangeAspect="1"/>
+            </wp:cNvGraphicFramePr>
+            <a:graphic xmlns:a="http://schemas.openxmlformats.org/drawingml/2006/main">
+              <a:graphicData uri="http://schemas.openxmlformats.org/drawingml/2006/picture">
+                <pic:pic xmlns:pic="http://schemas.openxmlformats.org/drawingml/2006/picture">
+                  <pic:nvPicPr>
+                    <pic:cNvPr id="0" name="" descr=""/>
+                    <pic:cNvPicPr>
+                      <a:picLocks noChangeAspect="1" noChangeArrowheads="1"/>
+                    </pic:cNvPicPr>
+                  </pic:nvPicPr>
+                  <pic:blipFill>
+                    <a:blip r:embed="rId16" cstate="none"/>
+                    <a:srcRect/>
+                    <a:stretch>
+                      <a:fillRect/>
+                    </a:stretch>
+                  </pic:blipFill>
+                  <pic:spPr bwMode="auto">
+                    <a:xfrm>
+                      <a:off x="0" y="0"/>
+                      <a:ext cx="6096000" cy="2000250"/>
+                    </a:xfrm>
+                    <a:prstGeom prst="rect">
+                      <a:avLst/>
+                    </a:prstGeom>
+                  </pic:spPr>
+                </pic:pic>
+              </a:graphicData>
+            </a:graphic>
+          </wp:inline>
+        </w:drawing>
+      </w:r>
+    </w:p>
+    <w:p>
+      <w:pPr>
+        <w:spacing w:after="200"/>
+        <w:jc w:val="center"/>
+      </w:pPr>
+      <w:r>
+        <w:rPr>
+          <w:i/>
+          <w:iCs/>
+          <w:color w:val="595959"/>
+          <w:sz w:val="18"/>
+          <w:szCs w:val="18"/>
+        </w:rPr>
+        <w:t xml:space="preserve">Figure 6. Test schedule</w:t>
       </w:r>
     </w:p>
     <w:p>
@@ -5893,14 +6157,14 @@
     </w:p>
     <w:p>
       <w:pPr>
-        <w:keepNext w:val="false"/>
+        <w:keepNext/>
       </w:pPr>
       <w:r>
         <w:rPr>
           <w:sz w:val="20"/>
           <w:szCs w:val="20"/>
         </w:rPr>
-        <w:t xml:space="preserve">The following tests were removed from the basic plan; they can be added back if resources and time allow.</w:t>
+        <w:t xml:space="preserve">The following tests were removed from the basic plan; they can be added back if resources and time allow:</w:t>
       </w:r>
     </w:p>
     <w:tbl>

</xml_diff>